<commit_message>
test(docx): add interleaved numId edge case to unit_test_headers_numbered
    Extends the existing test document with an Appendix section that uses a
    different numId, followed by list items that resume the original
    numbering sequence with Word-embedded start values (e.g. 2.3.1.).
    Updates groundtruth files accordingly.

Signed-off-by: Emre Çalışır <emrecalisir95@gmail.com>
</commit_message>
<xml_diff>
--- a/tests/data/docx/unit_test_headers_numbered.docx
+++ b/tests/data/docx/unit_test_headers_numbered.docx
@@ -1,6 +1,6 @@
 
 <file path=word/document.xml><?xml version="1.0" encoding="utf-8"?>
-<w:document xmlns:wpc="http://schemas.microsoft.com/office/word/2010/wordprocessingCanvas" xmlns:cx="http://schemas.microsoft.com/office/drawing/2014/chartex" xmlns:cx1="http://schemas.microsoft.com/office/drawing/2015/9/8/chartex" xmlns:cx2="http://schemas.microsoft.com/office/drawing/2015/10/21/chartex" xmlns:cx3="http://schemas.microsoft.com/office/drawing/2016/5/9/chartex" xmlns:cx4="http://schemas.microsoft.com/office/drawing/2016/5/10/chartex" xmlns:cx5="http://schemas.microsoft.com/office/drawing/2016/5/11/chartex" xmlns:cx6="http://schemas.microsoft.com/office/drawing/2016/5/12/chartex" xmlns:cx7="http://schemas.microsoft.com/office/drawing/2016/5/13/chartex" xmlns:cx8="http://schemas.microsoft.com/office/drawing/2016/5/14/chartex" xmlns:mc="http://schemas.openxmlformats.org/markup-compatibility/2006" xmlns:aink="http://schemas.microsoft.com/office/drawing/2016/ink" xmlns:am3d="http://schemas.microsoft.com/office/drawing/2017/model3d" xmlns:o="urn:schemas-microsoft-com:office:office" xmlns:oel="http://schemas.microsoft.com/office/2019/extlst" xmlns:r="http://schemas.openxmlformats.org/officeDocument/2006/relationships" xmlns:m="http://schemas.openxmlformats.org/officeDocument/2006/math" xmlns:v="urn:schemas-microsoft-com:vml" xmlns:wp14="http://schemas.microsoft.com/office/word/2010/wordprocessingDrawing" xmlns:wp="http://schemas.openxmlformats.org/drawingml/2006/wordprocessingDrawing" xmlns:w10="urn:schemas-microsoft-com:office:word" xmlns:w="http://schemas.openxmlformats.org/wordprocessingml/2006/main" xmlns:w14="http://schemas.microsoft.com/office/word/2010/wordml" xmlns:w15="http://schemas.microsoft.com/office/word/2012/wordml" xmlns:w16cex="http://schemas.microsoft.com/office/word/2018/wordml/cex" xmlns:w16cid="http://schemas.microsoft.com/office/word/2016/wordml/cid" xmlns:w16="http://schemas.microsoft.com/office/word/2018/wordml" xmlns:w16du="http://schemas.microsoft.com/office/word/2023/wordml/word16du" xmlns:w16sdtdh="http://schemas.microsoft.com/office/word/2020/wordml/sdtdatahash" xmlns:w16se="http://schemas.microsoft.com/office/word/2015/wordml/symex" xmlns:wpg="http://schemas.microsoft.com/office/word/2010/wordprocessingGroup" xmlns:wpi="http://schemas.microsoft.com/office/word/2010/wordprocessingInk" xmlns:wne="http://schemas.microsoft.com/office/word/2006/wordml" xmlns:wps="http://schemas.microsoft.com/office/word/2010/wordprocessingShape" mc:Ignorable="w14 w15 w16se w16cid w16 w16cex w16sdtdh w16du wp14">
+<w:document xmlns:wpc="http://schemas.microsoft.com/office/word/2010/wordprocessingCanvas" xmlns:cx="http://schemas.microsoft.com/office/drawing/2014/chartex" xmlns:cx1="http://schemas.microsoft.com/office/drawing/2015/9/8/chartex" xmlns:cx2="http://schemas.microsoft.com/office/drawing/2015/10/21/chartex" xmlns:cx3="http://schemas.microsoft.com/office/drawing/2016/5/9/chartex" xmlns:cx4="http://schemas.microsoft.com/office/drawing/2016/5/10/chartex" xmlns:cx5="http://schemas.microsoft.com/office/drawing/2016/5/11/chartex" xmlns:cx6="http://schemas.microsoft.com/office/drawing/2016/5/12/chartex" xmlns:cx7="http://schemas.microsoft.com/office/drawing/2016/5/13/chartex" xmlns:cx8="http://schemas.microsoft.com/office/drawing/2016/5/14/chartex" xmlns:mc="http://schemas.openxmlformats.org/markup-compatibility/2006" xmlns:aink="http://schemas.microsoft.com/office/drawing/2016/ink" xmlns:am3d="http://schemas.microsoft.com/office/drawing/2017/model3d" xmlns:o="urn:schemas-microsoft-com:office:office" xmlns:oel="http://schemas.microsoft.com/office/2019/extlst" xmlns:r="http://schemas.openxmlformats.org/officeDocument/2006/relationships" xmlns:m="http://schemas.openxmlformats.org/officeDocument/2006/math" xmlns:v="urn:schemas-microsoft-com:vml" xmlns:wp14="http://schemas.microsoft.com/office/word/2010/wordprocessingDrawing" xmlns:wp="http://schemas.openxmlformats.org/drawingml/2006/wordprocessingDrawing" xmlns:w10="urn:schemas-microsoft-com:office:word" xmlns:w="http://schemas.openxmlformats.org/wordprocessingml/2006/main" xmlns:w14="http://schemas.microsoft.com/office/word/2010/wordml" xmlns:w15="http://schemas.microsoft.com/office/word/2012/wordml" xmlns:w16cex="http://schemas.microsoft.com/office/word/2018/wordml/cex" xmlns:w16cid="http://schemas.microsoft.com/office/word/2016/wordml/cid" xmlns:w16="http://schemas.microsoft.com/office/word/2018/wordml" xmlns:w16du="http://schemas.microsoft.com/office/word/2023/wordml/word16du" xmlns:w16sdtdh="http://schemas.microsoft.com/office/word/2020/wordml/sdtdatahash" xmlns:w16sdtfl="http://schemas.microsoft.com/office/word/2024/wordml/sdtformatlock" xmlns:w16se="http://schemas.microsoft.com/office/word/2015/wordml/symex" xmlns:wpg="http://schemas.microsoft.com/office/word/2010/wordprocessingGroup" xmlns:wpi="http://schemas.microsoft.com/office/word/2010/wordprocessingInk" xmlns:wne="http://schemas.microsoft.com/office/word/2006/wordml" xmlns:wps="http://schemas.microsoft.com/office/word/2010/wordprocessingShape" mc:Ignorable="w14 w15 w16se w16cid w16 w16cex w16sdtdh w16sdtfl w16du wp14">
   <w:body>
     <w:p>
       <w:pPr>
@@ -10,7 +10,11 @@
         <w:t>Test Document</w:t>
       </w:r>
     </w:p>
-    <w:p/>
+    <w:p>
+      <w:pPr>
+        <w:pStyle w:val="KonuBal"/>
+      </w:pPr>
+    </w:p>
     <w:p>
       <w:pPr>
         <w:pStyle w:val="Heading1"/>
@@ -174,6 +178,494 @@
       </w:r>
     </w:p>
     <w:p/>
+    <w:p/>
+    <w:p/>
+    <w:p>
+      <w:pPr>
+        <w:numPr>
+          <w:ilvl w:val="0"/>
+          <w:numId w:val="3"/>
+        </w:numPr>
+        <w:rPr>
+          <w:lang w:val="tr-TR"/>
+        </w:rPr>
+      </w:pPr>
+      <w:proofErr w:type="spellStart"/>
+      <w:r>
+        <w:rPr>
+          <w:lang w:val="tr-TR"/>
+        </w:rPr>
+        <w:t>Appendix</w:t>
+      </w:r>
+      <w:proofErr w:type="spellEnd"/>
+      <w:r>
+        <w:rPr>
+          <w:lang w:val="tr-TR"/>
+        </w:rPr>
+        <w:t xml:space="preserve"> A: </w:t>
+      </w:r>
+      <w:proofErr w:type="spellStart"/>
+      <w:r>
+        <w:rPr>
+          <w:lang w:val="tr-TR"/>
+        </w:rPr>
+        <w:t>Glossary</w:t>
+      </w:r>
+      <w:proofErr w:type="spellEnd"/>
+    </w:p>
+    <w:p>
+      <w:pPr>
+        <w:numPr>
+          <w:ilvl w:val="1"/>
+          <w:numId w:val="3"/>
+        </w:numPr>
+        <w:rPr>
+          <w:lang w:val="tr-TR"/>
+        </w:rPr>
+      </w:pPr>
+      <w:proofErr w:type="spellStart"/>
+      <w:r>
+        <w:rPr>
+          <w:lang w:val="tr-TR"/>
+        </w:rPr>
+        <w:t>Section</w:t>
+      </w:r>
+      <w:proofErr w:type="spellEnd"/>
+      <w:r>
+        <w:rPr>
+          <w:lang w:val="tr-TR"/>
+        </w:rPr>
+        <w:t xml:space="preserve"> A.1</w:t>
+      </w:r>
+    </w:p>
+    <w:p>
+      <w:pPr>
+        <w:numPr>
+          <w:ilvl w:val="2"/>
+          <w:numId w:val="3"/>
+        </w:numPr>
+        <w:rPr>
+          <w:lang w:val="tr-TR"/>
+        </w:rPr>
+      </w:pPr>
+      <w:proofErr w:type="spellStart"/>
+      <w:r>
+        <w:rPr>
+          <w:lang w:val="tr-TR"/>
+        </w:rPr>
+        <w:t>Detail</w:t>
+      </w:r>
+      <w:proofErr w:type="spellEnd"/>
+      <w:r>
+        <w:rPr>
+          <w:lang w:val="tr-TR"/>
+        </w:rPr>
+        <w:t xml:space="preserve"> A.1.1</w:t>
+      </w:r>
+    </w:p>
+    <w:p>
+      <w:pPr>
+        <w:numPr>
+          <w:ilvl w:val="2"/>
+          <w:numId w:val="6"/>
+        </w:numPr>
+        <w:rPr>
+          <w:lang w:val="tr-TR"/>
+        </w:rPr>
+      </w:pPr>
+      <w:r>
+        <w:rPr>
+          <w:lang w:val="tr-TR"/>
+        </w:rPr>
+        <w:t xml:space="preserve">Hardware </w:t>
+      </w:r>
+      <w:proofErr w:type="spellStart"/>
+      <w:r>
+        <w:rPr>
+          <w:lang w:val="tr-TR"/>
+        </w:rPr>
+        <w:t>Constraints</w:t>
+      </w:r>
+      <w:proofErr w:type="spellEnd"/>
+      <w:r>
+        <w:rPr>
+          <w:lang w:val="tr-TR"/>
+        </w:rPr>
+        <w:t xml:space="preserve"> – </w:t>
+      </w:r>
+      <w:proofErr w:type="spellStart"/>
+      <w:r>
+        <w:rPr>
+          <w:lang w:val="tr-TR"/>
+        </w:rPr>
+        <w:t>Egde</w:t>
+      </w:r>
+      <w:proofErr w:type="spellEnd"/>
+      <w:r>
+        <w:rPr>
+          <w:lang w:val="tr-TR"/>
+        </w:rPr>
+        <w:t xml:space="preserve"> Case</w:t>
+      </w:r>
+    </w:p>
+    <w:p>
+      <w:pPr>
+        <w:numPr>
+          <w:ilvl w:val="2"/>
+          <w:numId w:val="6"/>
+        </w:numPr>
+        <w:rPr>
+          <w:lang w:val="tr-TR"/>
+        </w:rPr>
+      </w:pPr>
+      <w:r>
+        <w:rPr>
+          <w:lang w:val="tr-TR"/>
+        </w:rPr>
+        <w:t xml:space="preserve">Software </w:t>
+      </w:r>
+      <w:proofErr w:type="spellStart"/>
+      <w:r>
+        <w:rPr>
+          <w:lang w:val="tr-TR"/>
+        </w:rPr>
+        <w:t>Constraints</w:t>
+      </w:r>
+      <w:proofErr w:type="spellEnd"/>
+    </w:p>
+    <w:p>
+      <w:pPr>
+        <w:numPr>
+          <w:ilvl w:val="2"/>
+          <w:numId w:val="6"/>
+        </w:numPr>
+        <w:rPr>
+          <w:lang w:val="tr-TR"/>
+        </w:rPr>
+      </w:pPr>
+      <w:r>
+        <w:rPr>
+          <w:lang w:val="tr-TR"/>
+        </w:rPr>
+        <w:t xml:space="preserve">Network </w:t>
+      </w:r>
+      <w:proofErr w:type="spellStart"/>
+      <w:r>
+        <w:rPr>
+          <w:lang w:val="tr-TR"/>
+        </w:rPr>
+        <w:t>Constraints</w:t>
+      </w:r>
+      <w:proofErr w:type="spellEnd"/>
+    </w:p>
+    <w:p>
+      <w:pPr>
+        <w:numPr>
+          <w:ilvl w:val="2"/>
+          <w:numId w:val="6"/>
+        </w:numPr>
+        <w:rPr>
+          <w:lang w:val="tr-TR"/>
+        </w:rPr>
+      </w:pPr>
+      <w:proofErr w:type="spellStart"/>
+      <w:r>
+        <w:rPr>
+          <w:lang w:val="tr-TR"/>
+        </w:rPr>
+        <w:t>Environmental</w:t>
+      </w:r>
+      <w:proofErr w:type="spellEnd"/>
+      <w:r>
+        <w:rPr>
+          <w:lang w:val="tr-TR"/>
+        </w:rPr>
+        <w:t xml:space="preserve"> </w:t>
+      </w:r>
+      <w:proofErr w:type="spellStart"/>
+      <w:r>
+        <w:rPr>
+          <w:lang w:val="tr-TR"/>
+        </w:rPr>
+        <w:t>Constraints</w:t>
+      </w:r>
+      <w:proofErr w:type="spellEnd"/>
+    </w:p>
+    <w:p>
+      <w:pPr>
+        <w:numPr>
+          <w:ilvl w:val="2"/>
+          <w:numId w:val="6"/>
+        </w:numPr>
+        <w:rPr>
+          <w:lang w:val="tr-TR"/>
+        </w:rPr>
+      </w:pPr>
+      <w:proofErr w:type="spellStart"/>
+      <w:r>
+        <w:rPr>
+          <w:lang w:val="tr-TR"/>
+        </w:rPr>
+        <w:t>Regulatory</w:t>
+      </w:r>
+      <w:proofErr w:type="spellEnd"/>
+      <w:r>
+        <w:rPr>
+          <w:lang w:val="tr-TR"/>
+        </w:rPr>
+        <w:t xml:space="preserve"> </w:t>
+      </w:r>
+      <w:proofErr w:type="spellStart"/>
+      <w:r>
+        <w:rPr>
+          <w:lang w:val="tr-TR"/>
+        </w:rPr>
+        <w:t>Constraints</w:t>
+      </w:r>
+      <w:proofErr w:type="spellEnd"/>
+    </w:p>
+    <w:p>
+      <w:pPr>
+        <w:numPr>
+          <w:ilvl w:val="2"/>
+          <w:numId w:val="6"/>
+        </w:numPr>
+        <w:rPr>
+          <w:lang w:val="tr-TR"/>
+        </w:rPr>
+      </w:pPr>
+      <w:r>
+        <w:rPr>
+          <w:lang w:val="tr-TR"/>
+        </w:rPr>
+        <w:t xml:space="preserve">Budget </w:t>
+      </w:r>
+      <w:proofErr w:type="spellStart"/>
+      <w:r>
+        <w:rPr>
+          <w:lang w:val="tr-TR"/>
+        </w:rPr>
+        <w:t>Constraints</w:t>
+      </w:r>
+      <w:proofErr w:type="spellEnd"/>
+    </w:p>
+    <w:p>
+      <w:pPr>
+        <w:numPr>
+          <w:ilvl w:val="2"/>
+          <w:numId w:val="6"/>
+        </w:numPr>
+        <w:rPr>
+          <w:lang w:val="tr-TR"/>
+        </w:rPr>
+      </w:pPr>
+      <w:proofErr w:type="spellStart"/>
+      <w:r>
+        <w:rPr>
+          <w:lang w:val="tr-TR"/>
+        </w:rPr>
+        <w:t>Timeline</w:t>
+      </w:r>
+      <w:proofErr w:type="spellEnd"/>
+      <w:r>
+        <w:rPr>
+          <w:lang w:val="tr-TR"/>
+        </w:rPr>
+        <w:t xml:space="preserve"> </w:t>
+      </w:r>
+      <w:proofErr w:type="spellStart"/>
+      <w:r>
+        <w:rPr>
+          <w:lang w:val="tr-TR"/>
+        </w:rPr>
+        <w:t>Constraints</w:t>
+      </w:r>
+      <w:proofErr w:type="spellEnd"/>
+    </w:p>
+    <w:p>
+      <w:pPr>
+        <w:numPr>
+          <w:ilvl w:val="2"/>
+          <w:numId w:val="6"/>
+        </w:numPr>
+        <w:rPr>
+          <w:lang w:val="tr-TR"/>
+        </w:rPr>
+      </w:pPr>
+      <w:r>
+        <w:rPr>
+          <w:lang w:val="tr-TR"/>
+        </w:rPr>
+        <w:t xml:space="preserve">Resource </w:t>
+      </w:r>
+      <w:proofErr w:type="spellStart"/>
+      <w:r>
+        <w:rPr>
+          <w:lang w:val="tr-TR"/>
+        </w:rPr>
+        <w:t>Constraints</w:t>
+      </w:r>
+      <w:proofErr w:type="spellEnd"/>
+    </w:p>
+    <w:p>
+      <w:pPr>
+        <w:numPr>
+          <w:ilvl w:val="3"/>
+          <w:numId w:val="6"/>
+        </w:numPr>
+        <w:rPr>
+          <w:lang w:val="tr-TR"/>
+        </w:rPr>
+      </w:pPr>
+      <w:r>
+        <w:rPr>
+          <w:lang w:val="tr-TR"/>
+        </w:rPr>
+        <w:t xml:space="preserve">First </w:t>
+      </w:r>
+      <w:proofErr w:type="spellStart"/>
+      <w:r>
+        <w:rPr>
+          <w:lang w:val="tr-TR"/>
+        </w:rPr>
+        <w:t>sub-item</w:t>
+      </w:r>
+      <w:proofErr w:type="spellEnd"/>
+      <w:r>
+        <w:rPr>
+          <w:lang w:val="tr-TR"/>
+        </w:rPr>
+        <w:t xml:space="preserve"> at </w:t>
+      </w:r>
+      <w:proofErr w:type="spellStart"/>
+      <w:r>
+        <w:rPr>
+          <w:lang w:val="tr-TR"/>
+        </w:rPr>
+        <w:t>this</w:t>
+      </w:r>
+      <w:proofErr w:type="spellEnd"/>
+      <w:r>
+        <w:rPr>
+          <w:lang w:val="tr-TR"/>
+        </w:rPr>
+        <w:t xml:space="preserve"> </w:t>
+      </w:r>
+      <w:proofErr w:type="spellStart"/>
+      <w:r>
+        <w:rPr>
+          <w:lang w:val="tr-TR"/>
+        </w:rPr>
+        <w:t>level</w:t>
+      </w:r>
+      <w:proofErr w:type="spellEnd"/>
+    </w:p>
+    <w:p>
+      <w:pPr>
+        <w:numPr>
+          <w:ilvl w:val="3"/>
+          <w:numId w:val="6"/>
+        </w:numPr>
+        <w:rPr>
+          <w:lang w:val="tr-TR"/>
+        </w:rPr>
+      </w:pPr>
+      <w:r>
+        <w:rPr>
+          <w:lang w:val="tr-TR"/>
+        </w:rPr>
+        <w:t xml:space="preserve">Second </w:t>
+      </w:r>
+      <w:proofErr w:type="spellStart"/>
+      <w:r>
+        <w:rPr>
+          <w:lang w:val="tr-TR"/>
+        </w:rPr>
+        <w:t>sub-item</w:t>
+      </w:r>
+      <w:proofErr w:type="spellEnd"/>
+      <w:r>
+        <w:rPr>
+          <w:lang w:val="tr-TR"/>
+        </w:rPr>
+        <w:t xml:space="preserve"> at </w:t>
+      </w:r>
+      <w:proofErr w:type="spellStart"/>
+      <w:r>
+        <w:rPr>
+          <w:lang w:val="tr-TR"/>
+        </w:rPr>
+        <w:t>this</w:t>
+      </w:r>
+      <w:proofErr w:type="spellEnd"/>
+      <w:r>
+        <w:rPr>
+          <w:lang w:val="tr-TR"/>
+        </w:rPr>
+        <w:t xml:space="preserve"> </w:t>
+      </w:r>
+      <w:proofErr w:type="spellStart"/>
+      <w:r>
+        <w:rPr>
+          <w:lang w:val="tr-TR"/>
+        </w:rPr>
+        <w:t>level</w:t>
+      </w:r>
+      <w:proofErr w:type="spellEnd"/>
+    </w:p>
+    <w:p>
+      <w:pPr>
+        <w:numPr>
+          <w:ilvl w:val="3"/>
+          <w:numId w:val="6"/>
+        </w:numPr>
+        <w:rPr>
+          <w:lang w:val="tr-TR"/>
+        </w:rPr>
+      </w:pPr>
+      <w:r>
+        <w:rPr>
+          <w:lang w:val="tr-TR"/>
+        </w:rPr>
+        <w:t xml:space="preserve">Third </w:t>
+      </w:r>
+      <w:proofErr w:type="spellStart"/>
+      <w:r>
+        <w:rPr>
+          <w:lang w:val="tr-TR"/>
+        </w:rPr>
+        <w:t>sub-item</w:t>
+      </w:r>
+      <w:proofErr w:type="spellEnd"/>
+      <w:r>
+        <w:rPr>
+          <w:lang w:val="tr-TR"/>
+        </w:rPr>
+        <w:t xml:space="preserve"> at </w:t>
+      </w:r>
+      <w:proofErr w:type="spellStart"/>
+      <w:r>
+        <w:rPr>
+          <w:lang w:val="tr-TR"/>
+        </w:rPr>
+        <w:t>this</w:t>
+      </w:r>
+      <w:proofErr w:type="spellEnd"/>
+      <w:r>
+        <w:rPr>
+          <w:lang w:val="tr-TR"/>
+        </w:rPr>
+        <w:t xml:space="preserve"> </w:t>
+      </w:r>
+      <w:proofErr w:type="spellStart"/>
+      <w:r>
+        <w:rPr>
+          <w:lang w:val="tr-TR"/>
+        </w:rPr>
+        <w:t>level</w:t>
+      </w:r>
+      <w:proofErr w:type="spellEnd"/>
+    </w:p>
     <w:p/>
     <w:sectPr>
       <w:pgSz w:w="12240" w:h="15840"/>
@@ -186,7 +678,7 @@
 </file>
 
 <file path=word/endnotes.xml><?xml version="1.0" encoding="utf-8"?>
-<w:endnotes xmlns:wpc="http://schemas.microsoft.com/office/word/2010/wordprocessingCanvas" xmlns:cx="http://schemas.microsoft.com/office/drawing/2014/chartex" xmlns:cx1="http://schemas.microsoft.com/office/drawing/2015/9/8/chartex" xmlns:cx2="http://schemas.microsoft.com/office/drawing/2015/10/21/chartex" xmlns:cx3="http://schemas.microsoft.com/office/drawing/2016/5/9/chartex" xmlns:cx4="http://schemas.microsoft.com/office/drawing/2016/5/10/chartex" xmlns:cx5="http://schemas.microsoft.com/office/drawing/2016/5/11/chartex" xmlns:cx6="http://schemas.microsoft.com/office/drawing/2016/5/12/chartex" xmlns:cx7="http://schemas.microsoft.com/office/drawing/2016/5/13/chartex" xmlns:cx8="http://schemas.microsoft.com/office/drawing/2016/5/14/chartex" xmlns:mc="http://schemas.openxmlformats.org/markup-compatibility/2006" xmlns:aink="http://schemas.microsoft.com/office/drawing/2016/ink" xmlns:am3d="http://schemas.microsoft.com/office/drawing/2017/model3d" xmlns:o="urn:schemas-microsoft-com:office:office" xmlns:oel="http://schemas.microsoft.com/office/2019/extlst" xmlns:r="http://schemas.openxmlformats.org/officeDocument/2006/relationships" xmlns:m="http://schemas.openxmlformats.org/officeDocument/2006/math" xmlns:v="urn:schemas-microsoft-com:vml" xmlns:wp14="http://schemas.microsoft.com/office/word/2010/wordprocessingDrawing" xmlns:wp="http://schemas.openxmlformats.org/drawingml/2006/wordprocessingDrawing" xmlns:w10="urn:schemas-microsoft-com:office:word" xmlns:w="http://schemas.openxmlformats.org/wordprocessingml/2006/main" xmlns:w14="http://schemas.microsoft.com/office/word/2010/wordml" xmlns:w15="http://schemas.microsoft.com/office/word/2012/wordml" xmlns:w16cex="http://schemas.microsoft.com/office/word/2018/wordml/cex" xmlns:w16cid="http://schemas.microsoft.com/office/word/2016/wordml/cid" xmlns:w16="http://schemas.microsoft.com/office/word/2018/wordml" xmlns:w16du="http://schemas.microsoft.com/office/word/2023/wordml/word16du" xmlns:w16sdtdh="http://schemas.microsoft.com/office/word/2020/wordml/sdtdatahash" xmlns:w16se="http://schemas.microsoft.com/office/word/2015/wordml/symex" xmlns:wpg="http://schemas.microsoft.com/office/word/2010/wordprocessingGroup" xmlns:wpi="http://schemas.microsoft.com/office/word/2010/wordprocessingInk" xmlns:wne="http://schemas.microsoft.com/office/word/2006/wordml" xmlns:wps="http://schemas.microsoft.com/office/word/2010/wordprocessingShape" mc:Ignorable="w14 w15 w16se w16cid w16 w16cex w16sdtdh w16du wp14">
+<w:endnotes xmlns:wpc="http://schemas.microsoft.com/office/word/2010/wordprocessingCanvas" xmlns:cx="http://schemas.microsoft.com/office/drawing/2014/chartex" xmlns:cx1="http://schemas.microsoft.com/office/drawing/2015/9/8/chartex" xmlns:cx2="http://schemas.microsoft.com/office/drawing/2015/10/21/chartex" xmlns:cx3="http://schemas.microsoft.com/office/drawing/2016/5/9/chartex" xmlns:cx4="http://schemas.microsoft.com/office/drawing/2016/5/10/chartex" xmlns:cx5="http://schemas.microsoft.com/office/drawing/2016/5/11/chartex" xmlns:cx6="http://schemas.microsoft.com/office/drawing/2016/5/12/chartex" xmlns:cx7="http://schemas.microsoft.com/office/drawing/2016/5/13/chartex" xmlns:cx8="http://schemas.microsoft.com/office/drawing/2016/5/14/chartex" xmlns:mc="http://schemas.openxmlformats.org/markup-compatibility/2006" xmlns:aink="http://schemas.microsoft.com/office/drawing/2016/ink" xmlns:am3d="http://schemas.microsoft.com/office/drawing/2017/model3d" xmlns:o="urn:schemas-microsoft-com:office:office" xmlns:oel="http://schemas.microsoft.com/office/2019/extlst" xmlns:r="http://schemas.openxmlformats.org/officeDocument/2006/relationships" xmlns:m="http://schemas.openxmlformats.org/officeDocument/2006/math" xmlns:v="urn:schemas-microsoft-com:vml" xmlns:wp14="http://schemas.microsoft.com/office/word/2010/wordprocessingDrawing" xmlns:wp="http://schemas.openxmlformats.org/drawingml/2006/wordprocessingDrawing" xmlns:w10="urn:schemas-microsoft-com:office:word" xmlns:w="http://schemas.openxmlformats.org/wordprocessingml/2006/main" xmlns:w14="http://schemas.microsoft.com/office/word/2010/wordml" xmlns:w15="http://schemas.microsoft.com/office/word/2012/wordml" xmlns:w16cex="http://schemas.microsoft.com/office/word/2018/wordml/cex" xmlns:w16cid="http://schemas.microsoft.com/office/word/2016/wordml/cid" xmlns:w16="http://schemas.microsoft.com/office/word/2018/wordml" xmlns:w16du="http://schemas.microsoft.com/office/word/2023/wordml/word16du" xmlns:w16sdtdh="http://schemas.microsoft.com/office/word/2020/wordml/sdtdatahash" xmlns:w16sdtfl="http://schemas.microsoft.com/office/word/2024/wordml/sdtformatlock" xmlns:w16se="http://schemas.microsoft.com/office/word/2015/wordml/symex" xmlns:wpg="http://schemas.microsoft.com/office/word/2010/wordprocessingGroup" xmlns:wpi="http://schemas.microsoft.com/office/word/2010/wordprocessingInk" xmlns:wne="http://schemas.microsoft.com/office/word/2006/wordml" xmlns:wps="http://schemas.microsoft.com/office/word/2010/wordprocessingShape" mc:Ignorable="w14 w15 w16se w16cid w16 w16cex w16sdtdh w16sdtfl w16du wp14">
   <w:endnote w:type="separator" w:id="-1">
     <w:p>
       <w:r>
@@ -205,7 +697,7 @@
 </file>
 
 <file path=word/footnotes.xml><?xml version="1.0" encoding="utf-8"?>
-<w:footnotes xmlns:wpc="http://schemas.microsoft.com/office/word/2010/wordprocessingCanvas" xmlns:cx="http://schemas.microsoft.com/office/drawing/2014/chartex" xmlns:cx1="http://schemas.microsoft.com/office/drawing/2015/9/8/chartex" xmlns:cx2="http://schemas.microsoft.com/office/drawing/2015/10/21/chartex" xmlns:cx3="http://schemas.microsoft.com/office/drawing/2016/5/9/chartex" xmlns:cx4="http://schemas.microsoft.com/office/drawing/2016/5/10/chartex" xmlns:cx5="http://schemas.microsoft.com/office/drawing/2016/5/11/chartex" xmlns:cx6="http://schemas.microsoft.com/office/drawing/2016/5/12/chartex" xmlns:cx7="http://schemas.microsoft.com/office/drawing/2016/5/13/chartex" xmlns:cx8="http://schemas.microsoft.com/office/drawing/2016/5/14/chartex" xmlns:mc="http://schemas.openxmlformats.org/markup-compatibility/2006" xmlns:aink="http://schemas.microsoft.com/office/drawing/2016/ink" xmlns:am3d="http://schemas.microsoft.com/office/drawing/2017/model3d" xmlns:o="urn:schemas-microsoft-com:office:office" xmlns:oel="http://schemas.microsoft.com/office/2019/extlst" xmlns:r="http://schemas.openxmlformats.org/officeDocument/2006/relationships" xmlns:m="http://schemas.openxmlformats.org/officeDocument/2006/math" xmlns:v="urn:schemas-microsoft-com:vml" xmlns:wp14="http://schemas.microsoft.com/office/word/2010/wordprocessingDrawing" xmlns:wp="http://schemas.openxmlformats.org/drawingml/2006/wordprocessingDrawing" xmlns:w10="urn:schemas-microsoft-com:office:word" xmlns:w="http://schemas.openxmlformats.org/wordprocessingml/2006/main" xmlns:w14="http://schemas.microsoft.com/office/word/2010/wordml" xmlns:w15="http://schemas.microsoft.com/office/word/2012/wordml" xmlns:w16cex="http://schemas.microsoft.com/office/word/2018/wordml/cex" xmlns:w16cid="http://schemas.microsoft.com/office/word/2016/wordml/cid" xmlns:w16="http://schemas.microsoft.com/office/word/2018/wordml" xmlns:w16du="http://schemas.microsoft.com/office/word/2023/wordml/word16du" xmlns:w16sdtdh="http://schemas.microsoft.com/office/word/2020/wordml/sdtdatahash" xmlns:w16se="http://schemas.microsoft.com/office/word/2015/wordml/symex" xmlns:wpg="http://schemas.microsoft.com/office/word/2010/wordprocessingGroup" xmlns:wpi="http://schemas.microsoft.com/office/word/2010/wordprocessingInk" xmlns:wne="http://schemas.microsoft.com/office/word/2006/wordml" xmlns:wps="http://schemas.microsoft.com/office/word/2010/wordprocessingShape" mc:Ignorable="w14 w15 w16se w16cid w16 w16cex w16sdtdh w16du wp14">
+<w:footnotes xmlns:wpc="http://schemas.microsoft.com/office/word/2010/wordprocessingCanvas" xmlns:cx="http://schemas.microsoft.com/office/drawing/2014/chartex" xmlns:cx1="http://schemas.microsoft.com/office/drawing/2015/9/8/chartex" xmlns:cx2="http://schemas.microsoft.com/office/drawing/2015/10/21/chartex" xmlns:cx3="http://schemas.microsoft.com/office/drawing/2016/5/9/chartex" xmlns:cx4="http://schemas.microsoft.com/office/drawing/2016/5/10/chartex" xmlns:cx5="http://schemas.microsoft.com/office/drawing/2016/5/11/chartex" xmlns:cx6="http://schemas.microsoft.com/office/drawing/2016/5/12/chartex" xmlns:cx7="http://schemas.microsoft.com/office/drawing/2016/5/13/chartex" xmlns:cx8="http://schemas.microsoft.com/office/drawing/2016/5/14/chartex" xmlns:mc="http://schemas.openxmlformats.org/markup-compatibility/2006" xmlns:aink="http://schemas.microsoft.com/office/drawing/2016/ink" xmlns:am3d="http://schemas.microsoft.com/office/drawing/2017/model3d" xmlns:o="urn:schemas-microsoft-com:office:office" xmlns:oel="http://schemas.microsoft.com/office/2019/extlst" xmlns:r="http://schemas.openxmlformats.org/officeDocument/2006/relationships" xmlns:m="http://schemas.openxmlformats.org/officeDocument/2006/math" xmlns:v="urn:schemas-microsoft-com:vml" xmlns:wp14="http://schemas.microsoft.com/office/word/2010/wordprocessingDrawing" xmlns:wp="http://schemas.openxmlformats.org/drawingml/2006/wordprocessingDrawing" xmlns:w10="urn:schemas-microsoft-com:office:word" xmlns:w="http://schemas.openxmlformats.org/wordprocessingml/2006/main" xmlns:w14="http://schemas.microsoft.com/office/word/2010/wordml" xmlns:w15="http://schemas.microsoft.com/office/word/2012/wordml" xmlns:w16cex="http://schemas.microsoft.com/office/word/2018/wordml/cex" xmlns:w16cid="http://schemas.microsoft.com/office/word/2016/wordml/cid" xmlns:w16="http://schemas.microsoft.com/office/word/2018/wordml" xmlns:w16du="http://schemas.microsoft.com/office/word/2023/wordml/word16du" xmlns:w16sdtdh="http://schemas.microsoft.com/office/word/2020/wordml/sdtdatahash" xmlns:w16sdtfl="http://schemas.microsoft.com/office/word/2024/wordml/sdtformatlock" xmlns:w16se="http://schemas.microsoft.com/office/word/2015/wordml/symex" xmlns:wpg="http://schemas.microsoft.com/office/word/2010/wordprocessingGroup" xmlns:wpi="http://schemas.microsoft.com/office/word/2010/wordprocessingInk" xmlns:wne="http://schemas.microsoft.com/office/word/2006/wordml" xmlns:wps="http://schemas.microsoft.com/office/word/2010/wordprocessingShape" mc:Ignorable="w14 w15 w16se w16cid w16 w16cex w16sdtdh w16sdtfl w16du wp14">
   <w:footnote w:type="separator" w:id="-1">
     <w:p>
       <w:r>
@@ -224,8 +716,322 @@
 </file>
 
 <file path=word/numbering.xml><?xml version="1.0" encoding="utf-8"?>
-<w:numbering xmlns:wpc="http://schemas.microsoft.com/office/word/2010/wordprocessingCanvas" xmlns:cx="http://schemas.microsoft.com/office/drawing/2014/chartex" xmlns:cx1="http://schemas.microsoft.com/office/drawing/2015/9/8/chartex" xmlns:cx2="http://schemas.microsoft.com/office/drawing/2015/10/21/chartex" xmlns:cx3="http://schemas.microsoft.com/office/drawing/2016/5/9/chartex" xmlns:cx4="http://schemas.microsoft.com/office/drawing/2016/5/10/chartex" xmlns:cx5="http://schemas.microsoft.com/office/drawing/2016/5/11/chartex" xmlns:cx6="http://schemas.microsoft.com/office/drawing/2016/5/12/chartex" xmlns:cx7="http://schemas.microsoft.com/office/drawing/2016/5/13/chartex" xmlns:cx8="http://schemas.microsoft.com/office/drawing/2016/5/14/chartex" xmlns:mc="http://schemas.openxmlformats.org/markup-compatibility/2006" xmlns:aink="http://schemas.microsoft.com/office/drawing/2016/ink" xmlns:am3d="http://schemas.microsoft.com/office/drawing/2017/model3d" xmlns:o="urn:schemas-microsoft-com:office:office" xmlns:oel="http://schemas.microsoft.com/office/2019/extlst" xmlns:r="http://schemas.openxmlformats.org/officeDocument/2006/relationships" xmlns:m="http://schemas.openxmlformats.org/officeDocument/2006/math" xmlns:v="urn:schemas-microsoft-com:vml" xmlns:wp14="http://schemas.microsoft.com/office/word/2010/wordprocessingDrawing" xmlns:wp="http://schemas.openxmlformats.org/drawingml/2006/wordprocessingDrawing" xmlns:w10="urn:schemas-microsoft-com:office:word" xmlns:w="http://schemas.openxmlformats.org/wordprocessingml/2006/main" xmlns:w14="http://schemas.microsoft.com/office/word/2010/wordml" xmlns:w15="http://schemas.microsoft.com/office/word/2012/wordml" xmlns:w16cex="http://schemas.microsoft.com/office/word/2018/wordml/cex" xmlns:w16cid="http://schemas.microsoft.com/office/word/2016/wordml/cid" xmlns:w16="http://schemas.microsoft.com/office/word/2018/wordml" xmlns:w16du="http://schemas.microsoft.com/office/word/2023/wordml/word16du" xmlns:w16sdtdh="http://schemas.microsoft.com/office/word/2020/wordml/sdtdatahash" xmlns:w16se="http://schemas.microsoft.com/office/word/2015/wordml/symex" xmlns:wpg="http://schemas.microsoft.com/office/word/2010/wordprocessingGroup" xmlns:wpi="http://schemas.microsoft.com/office/word/2010/wordprocessingInk" xmlns:wne="http://schemas.microsoft.com/office/word/2006/wordml" xmlns:wps="http://schemas.microsoft.com/office/word/2010/wordprocessingShape" mc:Ignorable="w14 w15 w16se w16cid w16 w16cex w16sdtdh w16du wp14">
+<w:numbering xmlns:wpc="http://schemas.microsoft.com/office/word/2010/wordprocessingCanvas" xmlns:cx="http://schemas.microsoft.com/office/drawing/2014/chartex" xmlns:cx1="http://schemas.microsoft.com/office/drawing/2015/9/8/chartex" xmlns:cx2="http://schemas.microsoft.com/office/drawing/2015/10/21/chartex" xmlns:cx3="http://schemas.microsoft.com/office/drawing/2016/5/9/chartex" xmlns:cx4="http://schemas.microsoft.com/office/drawing/2016/5/10/chartex" xmlns:cx5="http://schemas.microsoft.com/office/drawing/2016/5/11/chartex" xmlns:cx6="http://schemas.microsoft.com/office/drawing/2016/5/12/chartex" xmlns:cx7="http://schemas.microsoft.com/office/drawing/2016/5/13/chartex" xmlns:cx8="http://schemas.microsoft.com/office/drawing/2016/5/14/chartex" xmlns:mc="http://schemas.openxmlformats.org/markup-compatibility/2006" xmlns:aink="http://schemas.microsoft.com/office/drawing/2016/ink" xmlns:am3d="http://schemas.microsoft.com/office/drawing/2017/model3d" xmlns:o="urn:schemas-microsoft-com:office:office" xmlns:oel="http://schemas.microsoft.com/office/2019/extlst" xmlns:r="http://schemas.openxmlformats.org/officeDocument/2006/relationships" xmlns:m="http://schemas.openxmlformats.org/officeDocument/2006/math" xmlns:v="urn:schemas-microsoft-com:vml" xmlns:wp14="http://schemas.microsoft.com/office/word/2010/wordprocessingDrawing" xmlns:wp="http://schemas.openxmlformats.org/drawingml/2006/wordprocessingDrawing" xmlns:w10="urn:schemas-microsoft-com:office:word" xmlns:w="http://schemas.openxmlformats.org/wordprocessingml/2006/main" xmlns:w14="http://schemas.microsoft.com/office/word/2010/wordml" xmlns:w15="http://schemas.microsoft.com/office/word/2012/wordml" xmlns:w16cex="http://schemas.microsoft.com/office/word/2018/wordml/cex" xmlns:w16cid="http://schemas.microsoft.com/office/word/2016/wordml/cid" xmlns:w16="http://schemas.microsoft.com/office/word/2018/wordml" xmlns:w16du="http://schemas.microsoft.com/office/word/2023/wordml/word16du" xmlns:w16sdtdh="http://schemas.microsoft.com/office/word/2020/wordml/sdtdatahash" xmlns:w16sdtfl="http://schemas.microsoft.com/office/word/2024/wordml/sdtformatlock" xmlns:w16se="http://schemas.microsoft.com/office/word/2015/wordml/symex" xmlns:wpg="http://schemas.microsoft.com/office/word/2010/wordprocessingGroup" xmlns:wpi="http://schemas.microsoft.com/office/word/2010/wordprocessingInk" xmlns:wne="http://schemas.microsoft.com/office/word/2006/wordml" xmlns:wps="http://schemas.microsoft.com/office/word/2010/wordprocessingShape" mc:Ignorable="w14 w15 w16se w16cid w16 w16cex w16sdtdh w16sdtfl w16du wp14">
   <w:abstractNum w:abstractNumId="0" w15:restartNumberingAfterBreak="0">
+    <w:nsid w:val="10F37E7E"/>
+    <w:multiLevelType w:val="multilevel"/>
+    <w:tmpl w:val="2716D486"/>
+    <w:styleLink w:val="GeerliListe2"/>
+    <w:lvl w:ilvl="0">
+      <w:start w:val="1"/>
+      <w:numFmt w:val="decimal"/>
+      <w:lvlText w:val="%1."/>
+      <w:lvlJc w:val="left"/>
+      <w:pPr>
+        <w:ind w:left="720" w:hanging="360"/>
+      </w:pPr>
+      <w:rPr>
+        <w:rFonts w:hint="default"/>
+      </w:rPr>
+    </w:lvl>
+    <w:lvl w:ilvl="1">
+      <w:start w:val="1"/>
+      <w:numFmt w:val="decimal"/>
+      <w:lvlText w:val="%1.%2."/>
+      <w:lvlJc w:val="left"/>
+      <w:pPr>
+        <w:ind w:left="1440" w:hanging="420"/>
+      </w:pPr>
+      <w:rPr>
+        <w:rFonts w:hint="default"/>
+      </w:rPr>
+    </w:lvl>
+    <w:lvl w:ilvl="2">
+      <w:start w:val="2"/>
+      <w:numFmt w:val="decimal"/>
+      <w:lvlText w:val="%1.%2.%3."/>
+      <w:lvlJc w:val="left"/>
+      <w:pPr>
+        <w:ind w:left="2160" w:hanging="480"/>
+      </w:pPr>
+      <w:rPr>
+        <w:rFonts w:hint="default"/>
+      </w:rPr>
+    </w:lvl>
+    <w:lvl w:ilvl="3">
+      <w:start w:val="1"/>
+      <w:numFmt w:val="decimal"/>
+      <w:lvlText w:val="%1.%2.%3.%4."/>
+      <w:lvlJc w:val="left"/>
+      <w:pPr>
+        <w:ind w:left="2880" w:hanging="540"/>
+      </w:pPr>
+      <w:rPr>
+        <w:rFonts w:hint="default"/>
+      </w:rPr>
+    </w:lvl>
+    <w:lvl w:ilvl="4">
+      <w:start w:val="1"/>
+      <w:numFmt w:val="decimal"/>
+      <w:lvlText w:val="%1.%2.%3.%4.%5."/>
+      <w:lvlJc w:val="left"/>
+      <w:pPr>
+        <w:ind w:left="3600" w:hanging="600"/>
+      </w:pPr>
+      <w:rPr>
+        <w:rFonts w:hint="default"/>
+      </w:rPr>
+    </w:lvl>
+    <w:lvl w:ilvl="5">
+      <w:start w:val="1"/>
+      <w:numFmt w:val="decimal"/>
+      <w:lvlText w:val="%1.%2.%3.%4.%5.%6."/>
+      <w:lvlJc w:val="left"/>
+      <w:pPr>
+        <w:ind w:left="4320" w:hanging="660"/>
+      </w:pPr>
+      <w:rPr>
+        <w:rFonts w:hint="default"/>
+      </w:rPr>
+    </w:lvl>
+    <w:lvl w:ilvl="6">
+      <w:start w:val="1"/>
+      <w:numFmt w:val="decimal"/>
+      <w:lvlText w:val="%1.%2.%3.%4.%5.%6.%7."/>
+      <w:lvlJc w:val="left"/>
+      <w:pPr>
+        <w:ind w:left="5040" w:hanging="720"/>
+      </w:pPr>
+      <w:rPr>
+        <w:rFonts w:hint="default"/>
+      </w:rPr>
+    </w:lvl>
+    <w:lvl w:ilvl="7">
+      <w:start w:val="1"/>
+      <w:numFmt w:val="decimal"/>
+      <w:lvlText w:val="%1.%2.%3.%4.%5.%6.%7.%8."/>
+      <w:lvlJc w:val="left"/>
+      <w:pPr>
+        <w:ind w:left="5760" w:hanging="780"/>
+      </w:pPr>
+      <w:rPr>
+        <w:rFonts w:hint="default"/>
+      </w:rPr>
+    </w:lvl>
+    <w:lvl w:ilvl="8">
+      <w:start w:val="1"/>
+      <w:numFmt w:val="decimal"/>
+      <w:lvlText w:val="%1.%2.%3.%4.%5.%6.%7.%8.%9."/>
+      <w:lvlJc w:val="left"/>
+      <w:pPr>
+        <w:ind w:left="6480" w:hanging="840"/>
+      </w:pPr>
+      <w:rPr>
+        <w:rFonts w:hint="default"/>
+      </w:rPr>
+    </w:lvl>
+  </w:abstractNum>
+  <w:abstractNum w:abstractNumId="1" w15:restartNumberingAfterBreak="0">
+    <w:nsid w:val="134D2C91"/>
+    <w:multiLevelType w:val="multilevel"/>
+    <w:tmpl w:val="9D346E30"/>
+    <w:styleLink w:val="GeerliListe3"/>
+    <w:lvl w:ilvl="0">
+      <w:start w:val="2"/>
+      <w:numFmt w:val="decimal"/>
+      <w:lvlText w:val="%1."/>
+      <w:lvlJc w:val="left"/>
+      <w:pPr>
+        <w:ind w:left="720" w:hanging="360"/>
+      </w:pPr>
+      <w:rPr>
+        <w:rFonts w:hint="default"/>
+      </w:rPr>
+    </w:lvl>
+    <w:lvl w:ilvl="1">
+      <w:start w:val="3"/>
+      <w:numFmt w:val="decimal"/>
+      <w:lvlText w:val="%1.%2."/>
+      <w:lvlJc w:val="left"/>
+      <w:pPr>
+        <w:ind w:left="1440" w:hanging="420"/>
+      </w:pPr>
+      <w:rPr>
+        <w:rFonts w:hint="default"/>
+      </w:rPr>
+    </w:lvl>
+    <w:lvl w:ilvl="2">
+      <w:start w:val="1"/>
+      <w:numFmt w:val="decimal"/>
+      <w:lvlText w:val="%1.%2.%3."/>
+      <w:lvlJc w:val="left"/>
+      <w:pPr>
+        <w:ind w:left="2160" w:hanging="480"/>
+      </w:pPr>
+      <w:rPr>
+        <w:rFonts w:hint="default"/>
+      </w:rPr>
+    </w:lvl>
+    <w:lvl w:ilvl="3">
+      <w:start w:val="1"/>
+      <w:numFmt w:val="decimal"/>
+      <w:lvlText w:val="%1.%2.%3.%4."/>
+      <w:lvlJc w:val="left"/>
+      <w:pPr>
+        <w:ind w:left="2880" w:hanging="540"/>
+      </w:pPr>
+      <w:rPr>
+        <w:rFonts w:hint="default"/>
+      </w:rPr>
+    </w:lvl>
+    <w:lvl w:ilvl="4">
+      <w:start w:val="1"/>
+      <w:numFmt w:val="decimal"/>
+      <w:lvlText w:val="%1.%2.%3.%4.%5."/>
+      <w:lvlJc w:val="left"/>
+      <w:pPr>
+        <w:ind w:left="3600" w:hanging="600"/>
+      </w:pPr>
+      <w:rPr>
+        <w:rFonts w:hint="default"/>
+      </w:rPr>
+    </w:lvl>
+    <w:lvl w:ilvl="5">
+      <w:start w:val="1"/>
+      <w:numFmt w:val="decimal"/>
+      <w:lvlText w:val="%1.%2.%3.%4.%5.%6."/>
+      <w:lvlJc w:val="left"/>
+      <w:pPr>
+        <w:ind w:left="4320" w:hanging="660"/>
+      </w:pPr>
+      <w:rPr>
+        <w:rFonts w:hint="default"/>
+      </w:rPr>
+    </w:lvl>
+    <w:lvl w:ilvl="6">
+      <w:start w:val="1"/>
+      <w:numFmt w:val="decimal"/>
+      <w:lvlText w:val="%1.%2.%3.%4.%5.%6.%7."/>
+      <w:lvlJc w:val="left"/>
+      <w:pPr>
+        <w:ind w:left="5040" w:hanging="720"/>
+      </w:pPr>
+      <w:rPr>
+        <w:rFonts w:hint="default"/>
+      </w:rPr>
+    </w:lvl>
+    <w:lvl w:ilvl="7">
+      <w:start w:val="1"/>
+      <w:numFmt w:val="decimal"/>
+      <w:lvlText w:val="%1.%2.%3.%4.%5.%6.%7.%8."/>
+      <w:lvlJc w:val="left"/>
+      <w:pPr>
+        <w:ind w:left="5760" w:hanging="780"/>
+      </w:pPr>
+      <w:rPr>
+        <w:rFonts w:hint="default"/>
+      </w:rPr>
+    </w:lvl>
+    <w:lvl w:ilvl="8">
+      <w:start w:val="1"/>
+      <w:numFmt w:val="decimal"/>
+      <w:lvlText w:val="%1.%2.%3.%4.%5.%6.%7.%8.%9."/>
+      <w:lvlJc w:val="left"/>
+      <w:pPr>
+        <w:ind w:left="6480" w:hanging="840"/>
+      </w:pPr>
+      <w:rPr>
+        <w:rFonts w:hint="default"/>
+      </w:rPr>
+    </w:lvl>
+  </w:abstractNum>
+  <w:abstractNum w:abstractNumId="2" w15:restartNumberingAfterBreak="0">
+    <w:nsid w:val="1DFC04D2"/>
+    <w:multiLevelType w:val="multilevel"/>
+    <w:tmpl w:val="053E9376"/>
+    <w:lvl w:ilvl="0">
+      <w:start w:val="1"/>
+      <w:numFmt w:val="decimal"/>
+      <w:lvlText w:val="%1."/>
+      <w:lvlJc w:val="left"/>
+      <w:pPr>
+        <w:ind w:left="720" w:hanging="360"/>
+      </w:pPr>
+    </w:lvl>
+    <w:lvl w:ilvl="1">
+      <w:start w:val="1"/>
+      <w:numFmt w:val="decimal"/>
+      <w:lvlText w:val="%1.%2."/>
+      <w:lvlJc w:val="left"/>
+      <w:pPr>
+        <w:ind w:left="1440" w:hanging="420"/>
+      </w:pPr>
+    </w:lvl>
+    <w:lvl w:ilvl="2">
+      <w:start w:val="1"/>
+      <w:numFmt w:val="decimal"/>
+      <w:lvlText w:val="%1.%2.%3."/>
+      <w:lvlJc w:val="left"/>
+      <w:pPr>
+        <w:ind w:left="2160" w:hanging="480"/>
+      </w:pPr>
+    </w:lvl>
+    <w:lvl w:ilvl="3">
+      <w:start w:val="1"/>
+      <w:numFmt w:val="decimal"/>
+      <w:lvlText w:val="%1.%2.%3.%4."/>
+      <w:lvlJc w:val="left"/>
+      <w:pPr>
+        <w:ind w:left="2880" w:hanging="540"/>
+      </w:pPr>
+    </w:lvl>
+    <w:lvl w:ilvl="4">
+      <w:start w:val="1"/>
+      <w:numFmt w:val="decimal"/>
+      <w:lvlText w:val="%1.%2.%3.%4.%5."/>
+      <w:lvlJc w:val="left"/>
+      <w:pPr>
+        <w:ind w:left="3600" w:hanging="600"/>
+      </w:pPr>
+    </w:lvl>
+    <w:lvl w:ilvl="5">
+      <w:start w:val="1"/>
+      <w:numFmt w:val="decimal"/>
+      <w:lvlText w:val="%1.%2.%3.%4.%5.%6."/>
+      <w:lvlJc w:val="left"/>
+      <w:pPr>
+        <w:ind w:left="4320" w:hanging="660"/>
+      </w:pPr>
+    </w:lvl>
+    <w:lvl w:ilvl="6">
+      <w:start w:val="1"/>
+      <w:numFmt w:val="decimal"/>
+      <w:lvlText w:val="%1.%2.%3.%4.%5.%6.%7."/>
+      <w:lvlJc w:val="left"/>
+      <w:pPr>
+        <w:ind w:left="5040" w:hanging="720"/>
+      </w:pPr>
+    </w:lvl>
+    <w:lvl w:ilvl="7">
+      <w:start w:val="1"/>
+      <w:numFmt w:val="decimal"/>
+      <w:lvlText w:val="%1.%2.%3.%4.%5.%6.%7.%8."/>
+      <w:lvlJc w:val="left"/>
+      <w:pPr>
+        <w:ind w:left="5760" w:hanging="780"/>
+      </w:pPr>
+    </w:lvl>
+    <w:lvl w:ilvl="8">
+      <w:start w:val="1"/>
+      <w:numFmt w:val="decimal"/>
+      <w:lvlText w:val="%1.%2.%3.%4.%5.%6.%7.%8.%9."/>
+      <w:lvlJc w:val="left"/>
+      <w:pPr>
+        <w:ind w:left="6480" w:hanging="840"/>
+      </w:pPr>
+    </w:lvl>
+  </w:abstractNum>
+  <w:abstractNum w:abstractNumId="3" w15:restartNumberingAfterBreak="0">
     <w:nsid w:val="2ACA4B26"/>
     <w:multiLevelType w:val="multilevel"/>
     <w:tmpl w:val="BAE2FCF0"/>
@@ -241,7 +1047,7 @@
     <w:lvl w:ilvl="1">
       <w:start w:val="1"/>
       <w:numFmt w:val="decimal"/>
-      <w:pStyle w:val="Heading2"/>
+      <w:pStyle w:val="Balk2"/>
       <w:lvlText w:val="%1.%2."/>
       <w:lvlJc w:val="left"/>
       <w:pPr>
@@ -251,7 +1057,7 @@
     <w:lvl w:ilvl="2">
       <w:start w:val="1"/>
       <w:numFmt w:val="decimal"/>
-      <w:pStyle w:val="Heading3"/>
+      <w:pStyle w:val="Balk3"/>
       <w:lvlText w:val="%1.%2.%3."/>
       <w:lvlJc w:val="left"/>
       <w:pPr>
@@ -310,17 +1116,437 @@
       <w:lvlJc w:val="left"/>
       <w:pPr>
         <w:ind w:left="4320" w:hanging="1440"/>
+      </w:pPr>
+    </w:lvl>
+  </w:abstractNum>
+  <w:abstractNum w:abstractNumId="4" w15:restartNumberingAfterBreak="0">
+    <w:nsid w:val="2F743512"/>
+    <w:multiLevelType w:val="multilevel"/>
+    <w:tmpl w:val="2716D486"/>
+    <w:lvl w:ilvl="0">
+      <w:start w:val="1"/>
+      <w:numFmt w:val="decimal"/>
+      <w:lvlText w:val="%1."/>
+      <w:lvlJc w:val="left"/>
+      <w:pPr>
+        <w:ind w:left="720" w:hanging="360"/>
+      </w:pPr>
+      <w:rPr>
+        <w:rFonts w:hint="default"/>
+      </w:rPr>
+    </w:lvl>
+    <w:lvl w:ilvl="1">
+      <w:start w:val="1"/>
+      <w:numFmt w:val="decimal"/>
+      <w:lvlText w:val="%1.%2."/>
+      <w:lvlJc w:val="left"/>
+      <w:pPr>
+        <w:ind w:left="1440" w:hanging="420"/>
+      </w:pPr>
+      <w:rPr>
+        <w:rFonts w:hint="default"/>
+      </w:rPr>
+    </w:lvl>
+    <w:lvl w:ilvl="2">
+      <w:start w:val="2"/>
+      <w:numFmt w:val="decimal"/>
+      <w:lvlText w:val="%1.%2.%3."/>
+      <w:lvlJc w:val="left"/>
+      <w:pPr>
+        <w:ind w:left="2160" w:hanging="480"/>
+      </w:pPr>
+      <w:rPr>
+        <w:rFonts w:hint="default"/>
+      </w:rPr>
+    </w:lvl>
+    <w:lvl w:ilvl="3">
+      <w:start w:val="1"/>
+      <w:numFmt w:val="decimal"/>
+      <w:lvlText w:val="%1.%2.%3.%4."/>
+      <w:lvlJc w:val="left"/>
+      <w:pPr>
+        <w:ind w:left="2880" w:hanging="540"/>
+      </w:pPr>
+      <w:rPr>
+        <w:rFonts w:hint="default"/>
+      </w:rPr>
+    </w:lvl>
+    <w:lvl w:ilvl="4">
+      <w:start w:val="1"/>
+      <w:numFmt w:val="decimal"/>
+      <w:lvlText w:val="%1.%2.%3.%4.%5."/>
+      <w:lvlJc w:val="left"/>
+      <w:pPr>
+        <w:ind w:left="3600" w:hanging="600"/>
+      </w:pPr>
+      <w:rPr>
+        <w:rFonts w:hint="default"/>
+      </w:rPr>
+    </w:lvl>
+    <w:lvl w:ilvl="5">
+      <w:start w:val="1"/>
+      <w:numFmt w:val="decimal"/>
+      <w:lvlText w:val="%1.%2.%3.%4.%5.%6."/>
+      <w:lvlJc w:val="left"/>
+      <w:pPr>
+        <w:ind w:left="4320" w:hanging="660"/>
+      </w:pPr>
+      <w:rPr>
+        <w:rFonts w:hint="default"/>
+      </w:rPr>
+    </w:lvl>
+    <w:lvl w:ilvl="6">
+      <w:start w:val="1"/>
+      <w:numFmt w:val="decimal"/>
+      <w:lvlText w:val="%1.%2.%3.%4.%5.%6.%7."/>
+      <w:lvlJc w:val="left"/>
+      <w:pPr>
+        <w:ind w:left="5040" w:hanging="720"/>
+      </w:pPr>
+      <w:rPr>
+        <w:rFonts w:hint="default"/>
+      </w:rPr>
+    </w:lvl>
+    <w:lvl w:ilvl="7">
+      <w:start w:val="1"/>
+      <w:numFmt w:val="decimal"/>
+      <w:lvlText w:val="%1.%2.%3.%4.%5.%6.%7.%8."/>
+      <w:lvlJc w:val="left"/>
+      <w:pPr>
+        <w:ind w:left="5760" w:hanging="780"/>
+      </w:pPr>
+      <w:rPr>
+        <w:rFonts w:hint="default"/>
+      </w:rPr>
+    </w:lvl>
+    <w:lvl w:ilvl="8">
+      <w:start w:val="1"/>
+      <w:numFmt w:val="decimal"/>
+      <w:lvlText w:val="%1.%2.%3.%4.%5.%6.%7.%8.%9."/>
+      <w:lvlJc w:val="left"/>
+      <w:pPr>
+        <w:ind w:left="6480" w:hanging="840"/>
+      </w:pPr>
+      <w:rPr>
+        <w:rFonts w:hint="default"/>
+      </w:rPr>
+    </w:lvl>
+  </w:abstractNum>
+  <w:abstractNum w:abstractNumId="5" w15:restartNumberingAfterBreak="0">
+    <w:nsid w:val="3F8063AA"/>
+    <w:multiLevelType w:val="multilevel"/>
+    <w:tmpl w:val="EAEABA7E"/>
+    <w:lvl w:ilvl="0">
+      <w:start w:val="2"/>
+      <w:numFmt w:val="decimal"/>
+      <w:lvlText w:val="%1."/>
+      <w:lvlJc w:val="left"/>
+      <w:pPr>
+        <w:ind w:left="720" w:hanging="360"/>
+      </w:pPr>
+      <w:rPr>
+        <w:rFonts w:hint="default"/>
+      </w:rPr>
+    </w:lvl>
+    <w:lvl w:ilvl="1">
+      <w:start w:val="3"/>
+      <w:numFmt w:val="decimal"/>
+      <w:lvlText w:val="%1.%2."/>
+      <w:lvlJc w:val="left"/>
+      <w:pPr>
+        <w:ind w:left="1440" w:hanging="420"/>
+      </w:pPr>
+      <w:rPr>
+        <w:rFonts w:hint="default"/>
+      </w:rPr>
+    </w:lvl>
+    <w:lvl w:ilvl="2">
+      <w:start w:val="1"/>
+      <w:numFmt w:val="decimal"/>
+      <w:lvlText w:val="%1.%2.%3."/>
+      <w:lvlJc w:val="left"/>
+      <w:pPr>
+        <w:ind w:left="2160" w:hanging="480"/>
+      </w:pPr>
+      <w:rPr>
+        <w:rFonts w:hint="default"/>
+      </w:rPr>
+    </w:lvl>
+    <w:lvl w:ilvl="3">
+      <w:start w:val="1"/>
+      <w:numFmt w:val="decimal"/>
+      <w:lvlText w:val="%1.%2.%3.%4."/>
+      <w:lvlJc w:val="left"/>
+      <w:pPr>
+        <w:ind w:left="2880" w:hanging="540"/>
+      </w:pPr>
+      <w:rPr>
+        <w:rFonts w:hint="default"/>
+      </w:rPr>
+    </w:lvl>
+    <w:lvl w:ilvl="4">
+      <w:start w:val="1"/>
+      <w:numFmt w:val="decimal"/>
+      <w:lvlText w:val="%1.%2.%3.%4.%5."/>
+      <w:lvlJc w:val="left"/>
+      <w:pPr>
+        <w:ind w:left="3600" w:hanging="600"/>
+      </w:pPr>
+      <w:rPr>
+        <w:rFonts w:hint="default"/>
+      </w:rPr>
+    </w:lvl>
+    <w:lvl w:ilvl="5">
+      <w:start w:val="1"/>
+      <w:numFmt w:val="decimal"/>
+      <w:lvlText w:val="%1.%2.%3.%4.%5.%6."/>
+      <w:lvlJc w:val="left"/>
+      <w:pPr>
+        <w:ind w:left="4320" w:hanging="660"/>
+      </w:pPr>
+      <w:rPr>
+        <w:rFonts w:hint="default"/>
+      </w:rPr>
+    </w:lvl>
+    <w:lvl w:ilvl="6">
+      <w:start w:val="1"/>
+      <w:numFmt w:val="decimal"/>
+      <w:lvlText w:val="%1.%2.%3.%4.%5.%6.%7."/>
+      <w:lvlJc w:val="left"/>
+      <w:pPr>
+        <w:ind w:left="5040" w:hanging="720"/>
+      </w:pPr>
+      <w:rPr>
+        <w:rFonts w:hint="default"/>
+      </w:rPr>
+    </w:lvl>
+    <w:lvl w:ilvl="7">
+      <w:start w:val="1"/>
+      <w:numFmt w:val="decimal"/>
+      <w:lvlText w:val="%1.%2.%3.%4.%5.%6.%7.%8."/>
+      <w:lvlJc w:val="left"/>
+      <w:pPr>
+        <w:ind w:left="5760" w:hanging="780"/>
+      </w:pPr>
+      <w:rPr>
+        <w:rFonts w:hint="default"/>
+      </w:rPr>
+    </w:lvl>
+    <w:lvl w:ilvl="8">
+      <w:start w:val="1"/>
+      <w:numFmt w:val="decimal"/>
+      <w:lvlText w:val="%1.%2.%3.%4.%5.%6.%7.%8.%9."/>
+      <w:lvlJc w:val="left"/>
+      <w:pPr>
+        <w:ind w:left="6480" w:hanging="840"/>
+      </w:pPr>
+      <w:rPr>
+        <w:rFonts w:hint="default"/>
+      </w:rPr>
+    </w:lvl>
+  </w:abstractNum>
+  <w:abstractNum w:abstractNumId="6" w15:restartNumberingAfterBreak="0">
+    <w:nsid w:val="4DE81376"/>
+    <w:multiLevelType w:val="multilevel"/>
+    <w:tmpl w:val="053E9376"/>
+    <w:styleLink w:val="GeerliListe1"/>
+    <w:lvl w:ilvl="0">
+      <w:start w:val="1"/>
+      <w:numFmt w:val="decimal"/>
+      <w:lvlText w:val="%1."/>
+      <w:lvlJc w:val="left"/>
+      <w:pPr>
+        <w:ind w:left="720" w:hanging="360"/>
+      </w:pPr>
+    </w:lvl>
+    <w:lvl w:ilvl="1">
+      <w:start w:val="1"/>
+      <w:numFmt w:val="decimal"/>
+      <w:lvlText w:val="%1.%2."/>
+      <w:lvlJc w:val="left"/>
+      <w:pPr>
+        <w:ind w:left="1440" w:hanging="420"/>
+      </w:pPr>
+    </w:lvl>
+    <w:lvl w:ilvl="2">
+      <w:start w:val="1"/>
+      <w:numFmt w:val="decimal"/>
+      <w:lvlText w:val="%1.%2.%3."/>
+      <w:lvlJc w:val="left"/>
+      <w:pPr>
+        <w:ind w:left="2160" w:hanging="480"/>
+      </w:pPr>
+    </w:lvl>
+    <w:lvl w:ilvl="3">
+      <w:start w:val="1"/>
+      <w:numFmt w:val="decimal"/>
+      <w:lvlText w:val="%1.%2.%3.%4."/>
+      <w:lvlJc w:val="left"/>
+      <w:pPr>
+        <w:ind w:left="2880" w:hanging="540"/>
+      </w:pPr>
+    </w:lvl>
+    <w:lvl w:ilvl="4">
+      <w:start w:val="1"/>
+      <w:numFmt w:val="decimal"/>
+      <w:lvlText w:val="%1.%2.%3.%4.%5."/>
+      <w:lvlJc w:val="left"/>
+      <w:pPr>
+        <w:ind w:left="3600" w:hanging="600"/>
+      </w:pPr>
+    </w:lvl>
+    <w:lvl w:ilvl="5">
+      <w:start w:val="1"/>
+      <w:numFmt w:val="decimal"/>
+      <w:lvlText w:val="%1.%2.%3.%4.%5.%6."/>
+      <w:lvlJc w:val="left"/>
+      <w:pPr>
+        <w:ind w:left="4320" w:hanging="660"/>
+      </w:pPr>
+    </w:lvl>
+    <w:lvl w:ilvl="6">
+      <w:start w:val="1"/>
+      <w:numFmt w:val="decimal"/>
+      <w:lvlText w:val="%1.%2.%3.%4.%5.%6.%7."/>
+      <w:lvlJc w:val="left"/>
+      <w:pPr>
+        <w:ind w:left="5040" w:hanging="720"/>
+      </w:pPr>
+    </w:lvl>
+    <w:lvl w:ilvl="7">
+      <w:start w:val="1"/>
+      <w:numFmt w:val="decimal"/>
+      <w:lvlText w:val="%1.%2.%3.%4.%5.%6.%7.%8."/>
+      <w:lvlJc w:val="left"/>
+      <w:pPr>
+        <w:ind w:left="5760" w:hanging="780"/>
+      </w:pPr>
+    </w:lvl>
+    <w:lvl w:ilvl="8">
+      <w:start w:val="1"/>
+      <w:numFmt w:val="decimal"/>
+      <w:lvlText w:val="%1.%2.%3.%4.%5.%6.%7.%8.%9."/>
+      <w:lvlJc w:val="left"/>
+      <w:pPr>
+        <w:ind w:left="6480" w:hanging="840"/>
+      </w:pPr>
+    </w:lvl>
+  </w:abstractNum>
+  <w:abstractNum w:abstractNumId="7" w15:restartNumberingAfterBreak="0">
+    <w:nsid w:val="5FA21719"/>
+    <w:multiLevelType w:val="multilevel"/>
+    <w:tmpl w:val="C4B87E20"/>
+    <w:lvl w:ilvl="0">
+      <w:start w:val="1"/>
+      <w:numFmt w:val="decimal"/>
+      <w:lvlText w:val="%1."/>
+      <w:lvlJc w:val="left"/>
+      <w:pPr>
+        <w:ind w:left="720" w:hanging="360"/>
+      </w:pPr>
+    </w:lvl>
+    <w:lvl w:ilvl="1">
+      <w:start w:val="1"/>
+      <w:numFmt w:val="decimal"/>
+      <w:lvlText w:val="%1.%2."/>
+      <w:lvlJc w:val="left"/>
+      <w:pPr>
+        <w:ind w:left="1440" w:hanging="420"/>
+      </w:pPr>
+    </w:lvl>
+    <w:lvl w:ilvl="2">
+      <w:start w:val="1"/>
+      <w:numFmt w:val="decimal"/>
+      <w:lvlText w:val="%1.%2.%3."/>
+      <w:lvlJc w:val="left"/>
+      <w:pPr>
+        <w:ind w:left="2160" w:hanging="480"/>
+      </w:pPr>
+    </w:lvl>
+    <w:lvl w:ilvl="3">
+      <w:start w:val="1"/>
+      <w:numFmt w:val="decimal"/>
+      <w:lvlText w:val="%1.%2.%3.%4."/>
+      <w:lvlJc w:val="left"/>
+      <w:pPr>
+        <w:ind w:left="2880" w:hanging="540"/>
+      </w:pPr>
+    </w:lvl>
+    <w:lvl w:ilvl="4">
+      <w:start w:val="1"/>
+      <w:numFmt w:val="decimal"/>
+      <w:lvlText w:val="%1.%2.%3.%4.%5."/>
+      <w:lvlJc w:val="left"/>
+      <w:pPr>
+        <w:ind w:left="3600" w:hanging="600"/>
+      </w:pPr>
+    </w:lvl>
+    <w:lvl w:ilvl="5">
+      <w:start w:val="1"/>
+      <w:numFmt w:val="decimal"/>
+      <w:lvlText w:val="%1.%2.%3.%4.%5.%6."/>
+      <w:lvlJc w:val="left"/>
+      <w:pPr>
+        <w:ind w:left="4320" w:hanging="660"/>
+      </w:pPr>
+    </w:lvl>
+    <w:lvl w:ilvl="6">
+      <w:start w:val="1"/>
+      <w:numFmt w:val="decimal"/>
+      <w:lvlText w:val="%1.%2.%3.%4.%5.%6.%7."/>
+      <w:lvlJc w:val="left"/>
+      <w:pPr>
+        <w:ind w:left="5040" w:hanging="720"/>
+      </w:pPr>
+    </w:lvl>
+    <w:lvl w:ilvl="7">
+      <w:start w:val="1"/>
+      <w:numFmt w:val="decimal"/>
+      <w:lvlText w:val="%1.%2.%3.%4.%5.%6.%7.%8."/>
+      <w:lvlJc w:val="left"/>
+      <w:pPr>
+        <w:ind w:left="5760" w:hanging="780"/>
+      </w:pPr>
+    </w:lvl>
+    <w:lvl w:ilvl="8">
+      <w:start w:val="1"/>
+      <w:numFmt w:val="decimal"/>
+      <w:lvlText w:val="%1.%2.%3.%4.%5.%6.%7.%8.%9."/>
+      <w:lvlJc w:val="left"/>
+      <w:pPr>
+        <w:ind w:left="6480" w:hanging="840"/>
       </w:pPr>
     </w:lvl>
   </w:abstractNum>
   <w:num w:numId="1" w16cid:durableId="394475057">
+    <w:abstractNumId w:val="3"/>
+  </w:num>
+  <w:num w:numId="2" w16cid:durableId="1368218177">
+    <w:abstractNumId w:val="2"/>
+  </w:num>
+  <w:num w:numId="3" w16cid:durableId="1446851125">
+    <w:abstractNumId w:val="7"/>
+  </w:num>
+  <w:num w:numId="4" w16cid:durableId="764424822">
+    <w:abstractNumId w:val="4"/>
+  </w:num>
+  <w:num w:numId="5" w16cid:durableId="1489983635">
+    <w:abstractNumId w:val="6"/>
+  </w:num>
+  <w:num w:numId="6" w16cid:durableId="1080906810">
+    <w:abstractNumId w:val="5"/>
+  </w:num>
+  <w:num w:numId="7" w16cid:durableId="1965773584">
     <w:abstractNumId w:val="0"/>
+  </w:num>
+  <w:num w:numId="8" w16cid:durableId="1706825683">
+    <w:abstractNumId w:val="1"/>
   </w:num>
 </w:numbering>
 </file>
 
 <file path=word/styles.xml><?xml version="1.0" encoding="utf-8"?>
-<w:styles xmlns:mc="http://schemas.openxmlformats.org/markup-compatibility/2006" xmlns:r="http://schemas.openxmlformats.org/officeDocument/2006/relationships" xmlns:w="http://schemas.openxmlformats.org/wordprocessingml/2006/main" xmlns:w14="http://schemas.microsoft.com/office/word/2010/wordml" xmlns:w15="http://schemas.microsoft.com/office/word/2012/wordml" xmlns:w16cex="http://schemas.microsoft.com/office/word/2018/wordml/cex" xmlns:w16cid="http://schemas.microsoft.com/office/word/2016/wordml/cid" xmlns:w16="http://schemas.microsoft.com/office/word/2018/wordml" xmlns:w16du="http://schemas.microsoft.com/office/word/2023/wordml/word16du" xmlns:w16sdtdh="http://schemas.microsoft.com/office/word/2020/wordml/sdtdatahash" xmlns:w16se="http://schemas.microsoft.com/office/word/2015/wordml/symex" mc:Ignorable="w14 w15 w16se w16cid w16 w16cex w16sdtdh w16du">
+<w:styles xmlns:mc="http://schemas.openxmlformats.org/markup-compatibility/2006" xmlns:r="http://schemas.openxmlformats.org/officeDocument/2006/relationships" xmlns:w="http://schemas.openxmlformats.org/wordprocessingml/2006/main" xmlns:w14="http://schemas.microsoft.com/office/word/2010/wordml" xmlns:w15="http://schemas.microsoft.com/office/word/2012/wordml" xmlns:w16cex="http://schemas.microsoft.com/office/word/2018/wordml/cex" xmlns:w16cid="http://schemas.microsoft.com/office/word/2016/wordml/cid" xmlns:w16="http://schemas.microsoft.com/office/word/2018/wordml" xmlns:w16du="http://schemas.microsoft.com/office/word/2023/wordml/word16du" xmlns:w16sdtdh="http://schemas.microsoft.com/office/word/2020/wordml/sdtdatahash" xmlns:w16sdtfl="http://schemas.microsoft.com/office/word/2024/wordml/sdtformatlock" xmlns:w16se="http://schemas.microsoft.com/office/word/2015/wordml/symex" mc:Ignorable="w14 w15 w16se w16cid w16 w16cex w16sdtdh w16sdtfl w16du">
   <w:docDefaults>
     <w:rPrDefault>
       <w:rPr>
@@ -720,7 +1946,7 @@
     <w:name w:val="heading 1"/>
     <w:basedOn w:val="Normal"/>
     <w:next w:val="Normal"/>
-    <w:link w:val="Heading1Char"/>
+    <w:link w:val="Balk1Char"/>
     <w:uiPriority w:val="9"/>
     <w:qFormat/>
     <w:rsid w:val="009729E7"/>
@@ -741,7 +1967,7 @@
     <w:name w:val="heading 2"/>
     <w:basedOn w:val="Normal"/>
     <w:next w:val="Normal"/>
-    <w:link w:val="Heading2Char"/>
+    <w:link w:val="Balk2Char"/>
     <w:uiPriority w:val="9"/>
     <w:unhideWhenUsed/>
     <w:qFormat/>
@@ -767,7 +1993,7 @@
     <w:name w:val="heading 3"/>
     <w:basedOn w:val="Normal"/>
     <w:next w:val="Normal"/>
-    <w:link w:val="Heading3Char"/>
+    <w:link w:val="Balk3Char"/>
     <w:uiPriority w:val="9"/>
     <w:unhideWhenUsed/>
     <w:qFormat/>
@@ -789,11 +2015,11 @@
       <w:szCs w:val="28"/>
     </w:rPr>
   </w:style>
-  <w:style w:type="paragraph" w:styleId="Heading4">
+  <w:style w:type="paragraph" w:styleId="Balk4">
     <w:name w:val="heading 4"/>
     <w:basedOn w:val="Normal"/>
     <w:next w:val="Normal"/>
-    <w:link w:val="Heading4Char"/>
+    <w:link w:val="Balk4Char"/>
     <w:uiPriority w:val="9"/>
     <w:semiHidden/>
     <w:unhideWhenUsed/>
@@ -812,11 +2038,11 @@
       <w:color w:val="0F4761" w:themeColor="accent1" w:themeShade="BF"/>
     </w:rPr>
   </w:style>
-  <w:style w:type="paragraph" w:styleId="Heading5">
+  <w:style w:type="paragraph" w:styleId="Balk5">
     <w:name w:val="heading 5"/>
     <w:basedOn w:val="Normal"/>
     <w:next w:val="Normal"/>
-    <w:link w:val="Heading5Char"/>
+    <w:link w:val="Balk5Char"/>
     <w:uiPriority w:val="9"/>
     <w:semiHidden/>
     <w:unhideWhenUsed/>
@@ -833,11 +2059,11 @@
       <w:color w:val="0F4761" w:themeColor="accent1" w:themeShade="BF"/>
     </w:rPr>
   </w:style>
-  <w:style w:type="paragraph" w:styleId="Heading6">
+  <w:style w:type="paragraph" w:styleId="Balk6">
     <w:name w:val="heading 6"/>
     <w:basedOn w:val="Normal"/>
     <w:next w:val="Normal"/>
-    <w:link w:val="Heading6Char"/>
+    <w:link w:val="Balk6Char"/>
     <w:uiPriority w:val="9"/>
     <w:semiHidden/>
     <w:unhideWhenUsed/>
@@ -856,11 +2082,11 @@
       <w:color w:val="595959" w:themeColor="text1" w:themeTint="A6"/>
     </w:rPr>
   </w:style>
-  <w:style w:type="paragraph" w:styleId="Heading7">
+  <w:style w:type="paragraph" w:styleId="Balk7">
     <w:name w:val="heading 7"/>
     <w:basedOn w:val="Normal"/>
     <w:next w:val="Normal"/>
-    <w:link w:val="Heading7Char"/>
+    <w:link w:val="Balk7Char"/>
     <w:uiPriority w:val="9"/>
     <w:semiHidden/>
     <w:unhideWhenUsed/>
@@ -877,11 +2103,11 @@
       <w:color w:val="595959" w:themeColor="text1" w:themeTint="A6"/>
     </w:rPr>
   </w:style>
-  <w:style w:type="paragraph" w:styleId="Heading8">
+  <w:style w:type="paragraph" w:styleId="Balk8">
     <w:name w:val="heading 8"/>
     <w:basedOn w:val="Normal"/>
     <w:next w:val="Normal"/>
-    <w:link w:val="Heading8Char"/>
+    <w:link w:val="Balk8Char"/>
     <w:uiPriority w:val="9"/>
     <w:semiHidden/>
     <w:unhideWhenUsed/>
@@ -899,11 +2125,11 @@
       <w:color w:val="272727" w:themeColor="text1" w:themeTint="D8"/>
     </w:rPr>
   </w:style>
-  <w:style w:type="paragraph" w:styleId="Heading9">
+  <w:style w:type="paragraph" w:styleId="Balk9">
     <w:name w:val="heading 9"/>
     <w:basedOn w:val="Normal"/>
     <w:next w:val="Normal"/>
-    <w:link w:val="Heading9Char"/>
+    <w:link w:val="Balk9Char"/>
     <w:uiPriority w:val="9"/>
     <w:semiHidden/>
     <w:unhideWhenUsed/>
@@ -919,13 +2145,13 @@
       <w:color w:val="272727" w:themeColor="text1" w:themeTint="D8"/>
     </w:rPr>
   </w:style>
-  <w:style w:type="character" w:default="1" w:styleId="DefaultParagraphFont">
+  <w:style w:type="character" w:default="1" w:styleId="VarsaylanParagrafYazTipi">
     <w:name w:val="Default Paragraph Font"/>
     <w:uiPriority w:val="1"/>
     <w:semiHidden/>
     <w:unhideWhenUsed/>
   </w:style>
-  <w:style w:type="table" w:default="1" w:styleId="TableNormal">
+  <w:style w:type="table" w:default="1" w:styleId="NormalTablo">
     <w:name w:val="Normal Table"/>
     <w:uiPriority w:val="99"/>
     <w:semiHidden/>
@@ -940,16 +2166,16 @@
       </w:tblCellMar>
     </w:tblPr>
   </w:style>
-  <w:style w:type="numbering" w:default="1" w:styleId="NoList">
+  <w:style w:type="numbering" w:default="1" w:styleId="ListeYok">
     <w:name w:val="No List"/>
     <w:uiPriority w:val="99"/>
     <w:semiHidden/>
     <w:unhideWhenUsed/>
   </w:style>
-  <w:style w:type="character" w:customStyle="1" w:styleId="Heading1Char">
-    <w:name w:val="Heading 1 Char"/>
-    <w:basedOn w:val="DefaultParagraphFont"/>
-    <w:link w:val="Heading1"/>
+  <w:style w:type="character" w:customStyle="1" w:styleId="Balk1Char">
+    <w:name w:val="Başlık 1 Char"/>
+    <w:basedOn w:val="VarsaylanParagrafYazTipi"/>
+    <w:link w:val="Balk1"/>
     <w:uiPriority w:val="9"/>
     <w:rsid w:val="009729E7"/>
     <w:rPr>
@@ -959,10 +2185,10 @@
       <w:szCs w:val="40"/>
     </w:rPr>
   </w:style>
-  <w:style w:type="character" w:customStyle="1" w:styleId="Heading2Char">
-    <w:name w:val="Heading 2 Char"/>
-    <w:basedOn w:val="DefaultParagraphFont"/>
-    <w:link w:val="Heading2"/>
+  <w:style w:type="character" w:customStyle="1" w:styleId="Balk2Char">
+    <w:name w:val="Başlık 2 Char"/>
+    <w:basedOn w:val="VarsaylanParagrafYazTipi"/>
+    <w:link w:val="Balk2"/>
     <w:uiPriority w:val="9"/>
     <w:rsid w:val="00B666D6"/>
     <w:rPr>
@@ -972,10 +2198,10 @@
       <w:szCs w:val="32"/>
     </w:rPr>
   </w:style>
-  <w:style w:type="character" w:customStyle="1" w:styleId="Heading3Char">
-    <w:name w:val="Heading 3 Char"/>
-    <w:basedOn w:val="DefaultParagraphFont"/>
-    <w:link w:val="Heading3"/>
+  <w:style w:type="character" w:customStyle="1" w:styleId="Balk3Char">
+    <w:name w:val="Başlık 3 Char"/>
+    <w:basedOn w:val="VarsaylanParagrafYazTipi"/>
+    <w:link w:val="Balk3"/>
     <w:uiPriority w:val="9"/>
     <w:rsid w:val="00B666D6"/>
     <w:rPr>
@@ -985,10 +2211,10 @@
       <w:szCs w:val="28"/>
     </w:rPr>
   </w:style>
-  <w:style w:type="character" w:customStyle="1" w:styleId="Heading4Char">
-    <w:name w:val="Heading 4 Char"/>
-    <w:basedOn w:val="DefaultParagraphFont"/>
-    <w:link w:val="Heading4"/>
+  <w:style w:type="character" w:customStyle="1" w:styleId="Balk4Char">
+    <w:name w:val="Başlık 4 Char"/>
+    <w:basedOn w:val="VarsaylanParagrafYazTipi"/>
+    <w:link w:val="Balk4"/>
     <w:uiPriority w:val="9"/>
     <w:semiHidden/>
     <w:rsid w:val="009729E7"/>
@@ -999,10 +2225,10 @@
       <w:color w:val="0F4761" w:themeColor="accent1" w:themeShade="BF"/>
     </w:rPr>
   </w:style>
-  <w:style w:type="character" w:customStyle="1" w:styleId="Heading5Char">
-    <w:name w:val="Heading 5 Char"/>
-    <w:basedOn w:val="DefaultParagraphFont"/>
-    <w:link w:val="Heading5"/>
+  <w:style w:type="character" w:customStyle="1" w:styleId="Balk5Char">
+    <w:name w:val="Başlık 5 Char"/>
+    <w:basedOn w:val="VarsaylanParagrafYazTipi"/>
+    <w:link w:val="Balk5"/>
     <w:uiPriority w:val="9"/>
     <w:semiHidden/>
     <w:rsid w:val="009729E7"/>
@@ -1011,10 +2237,10 @@
       <w:color w:val="0F4761" w:themeColor="accent1" w:themeShade="BF"/>
     </w:rPr>
   </w:style>
-  <w:style w:type="character" w:customStyle="1" w:styleId="Heading6Char">
-    <w:name w:val="Heading 6 Char"/>
-    <w:basedOn w:val="DefaultParagraphFont"/>
-    <w:link w:val="Heading6"/>
+  <w:style w:type="character" w:customStyle="1" w:styleId="Balk6Char">
+    <w:name w:val="Başlık 6 Char"/>
+    <w:basedOn w:val="VarsaylanParagrafYazTipi"/>
+    <w:link w:val="Balk6"/>
     <w:uiPriority w:val="9"/>
     <w:semiHidden/>
     <w:rsid w:val="009729E7"/>
@@ -1025,10 +2251,10 @@
       <w:color w:val="595959" w:themeColor="text1" w:themeTint="A6"/>
     </w:rPr>
   </w:style>
-  <w:style w:type="character" w:customStyle="1" w:styleId="Heading7Char">
-    <w:name w:val="Heading 7 Char"/>
-    <w:basedOn w:val="DefaultParagraphFont"/>
-    <w:link w:val="Heading7"/>
+  <w:style w:type="character" w:customStyle="1" w:styleId="Balk7Char">
+    <w:name w:val="Başlık 7 Char"/>
+    <w:basedOn w:val="VarsaylanParagrafYazTipi"/>
+    <w:link w:val="Balk7"/>
     <w:uiPriority w:val="9"/>
     <w:semiHidden/>
     <w:rsid w:val="009729E7"/>
@@ -1037,10 +2263,10 @@
       <w:color w:val="595959" w:themeColor="text1" w:themeTint="A6"/>
     </w:rPr>
   </w:style>
-  <w:style w:type="character" w:customStyle="1" w:styleId="Heading8Char">
-    <w:name w:val="Heading 8 Char"/>
-    <w:basedOn w:val="DefaultParagraphFont"/>
-    <w:link w:val="Heading8"/>
+  <w:style w:type="character" w:customStyle="1" w:styleId="Balk8Char">
+    <w:name w:val="Başlık 8 Char"/>
+    <w:basedOn w:val="VarsaylanParagrafYazTipi"/>
+    <w:link w:val="Balk8"/>
     <w:uiPriority w:val="9"/>
     <w:semiHidden/>
     <w:rsid w:val="009729E7"/>
@@ -1051,10 +2277,10 @@
       <w:color w:val="272727" w:themeColor="text1" w:themeTint="D8"/>
     </w:rPr>
   </w:style>
-  <w:style w:type="character" w:customStyle="1" w:styleId="Heading9Char">
-    <w:name w:val="Heading 9 Char"/>
-    <w:basedOn w:val="DefaultParagraphFont"/>
-    <w:link w:val="Heading9"/>
+  <w:style w:type="character" w:customStyle="1" w:styleId="Balk9Char">
+    <w:name w:val="Başlık 9 Char"/>
+    <w:basedOn w:val="VarsaylanParagrafYazTipi"/>
+    <w:link w:val="Balk9"/>
     <w:uiPriority w:val="9"/>
     <w:semiHidden/>
     <w:rsid w:val="009729E7"/>
@@ -1067,7 +2293,7 @@
     <w:name w:val="Title"/>
     <w:basedOn w:val="Normal"/>
     <w:next w:val="Normal"/>
-    <w:link w:val="TitleChar"/>
+    <w:link w:val="KonuBalChar"/>
     <w:uiPriority w:val="10"/>
     <w:qFormat/>
     <w:rsid w:val="009729E7"/>
@@ -1083,10 +2309,10 @@
       <w:szCs w:val="56"/>
     </w:rPr>
   </w:style>
-  <w:style w:type="character" w:customStyle="1" w:styleId="TitleChar">
-    <w:name w:val="Title Char"/>
-    <w:basedOn w:val="DefaultParagraphFont"/>
-    <w:link w:val="Title"/>
+  <w:style w:type="character" w:customStyle="1" w:styleId="KonuBalChar">
+    <w:name w:val="Konu Başlığı Char"/>
+    <w:basedOn w:val="VarsaylanParagrafYazTipi"/>
+    <w:link w:val="KonuBal"/>
     <w:uiPriority w:val="10"/>
     <w:rsid w:val="009729E7"/>
     <w:rPr>
@@ -1097,11 +2323,11 @@
       <w:szCs w:val="56"/>
     </w:rPr>
   </w:style>
-  <w:style w:type="paragraph" w:styleId="Subtitle">
+  <w:style w:type="paragraph" w:styleId="Altyaz">
     <w:name w:val="Subtitle"/>
     <w:basedOn w:val="Normal"/>
     <w:next w:val="Normal"/>
-    <w:link w:val="SubtitleChar"/>
+    <w:link w:val="AltyazChar"/>
     <w:uiPriority w:val="11"/>
     <w:qFormat/>
     <w:rsid w:val="009729E7"/>
@@ -1119,10 +2345,10 @@
       <w:szCs w:val="28"/>
     </w:rPr>
   </w:style>
-  <w:style w:type="character" w:customStyle="1" w:styleId="SubtitleChar">
-    <w:name w:val="Subtitle Char"/>
-    <w:basedOn w:val="DefaultParagraphFont"/>
-    <w:link w:val="Subtitle"/>
+  <w:style w:type="character" w:customStyle="1" w:styleId="AltyazChar">
+    <w:name w:val="Altyazı Char"/>
+    <w:basedOn w:val="VarsaylanParagrafYazTipi"/>
+    <w:link w:val="Altyaz"/>
     <w:uiPriority w:val="11"/>
     <w:rsid w:val="009729E7"/>
     <w:rPr>
@@ -1133,11 +2359,11 @@
       <w:szCs w:val="28"/>
     </w:rPr>
   </w:style>
-  <w:style w:type="paragraph" w:styleId="Quote">
+  <w:style w:type="paragraph" w:styleId="Alnt">
     <w:name w:val="Quote"/>
     <w:basedOn w:val="Normal"/>
     <w:next w:val="Normal"/>
-    <w:link w:val="QuoteChar"/>
+    <w:link w:val="AlntChar"/>
     <w:uiPriority w:val="29"/>
     <w:qFormat/>
     <w:rsid w:val="009729E7"/>
@@ -1151,10 +2377,10 @@
       <w:color w:val="404040" w:themeColor="text1" w:themeTint="BF"/>
     </w:rPr>
   </w:style>
-  <w:style w:type="character" w:customStyle="1" w:styleId="QuoteChar">
-    <w:name w:val="Quote Char"/>
-    <w:basedOn w:val="DefaultParagraphFont"/>
-    <w:link w:val="Quote"/>
+  <w:style w:type="character" w:customStyle="1" w:styleId="AlntChar">
+    <w:name w:val="Alıntı Char"/>
+    <w:basedOn w:val="VarsaylanParagrafYazTipi"/>
+    <w:link w:val="Alnt"/>
     <w:uiPriority w:val="29"/>
     <w:rsid w:val="009729E7"/>
     <w:rPr>
@@ -1174,9 +2400,9 @@
       <w:contextualSpacing/>
     </w:pPr>
   </w:style>
-  <w:style w:type="character" w:styleId="IntenseEmphasis">
+  <w:style w:type="character" w:styleId="GlVurgulama">
     <w:name w:val="Intense Emphasis"/>
-    <w:basedOn w:val="DefaultParagraphFont"/>
+    <w:basedOn w:val="VarsaylanParagrafYazTipi"/>
     <w:uiPriority w:val="21"/>
     <w:qFormat/>
     <w:rsid w:val="009729E7"/>
@@ -1186,11 +2412,11 @@
       <w:color w:val="0F4761" w:themeColor="accent1" w:themeShade="BF"/>
     </w:rPr>
   </w:style>
-  <w:style w:type="paragraph" w:styleId="IntenseQuote">
+  <w:style w:type="paragraph" w:styleId="GlAlnt">
     <w:name w:val="Intense Quote"/>
     <w:basedOn w:val="Normal"/>
     <w:next w:val="Normal"/>
-    <w:link w:val="IntenseQuoteChar"/>
+    <w:link w:val="GlAlntChar"/>
     <w:uiPriority w:val="30"/>
     <w:qFormat/>
     <w:rsid w:val="009729E7"/>
@@ -1209,10 +2435,10 @@
       <w:color w:val="0F4761" w:themeColor="accent1" w:themeShade="BF"/>
     </w:rPr>
   </w:style>
-  <w:style w:type="character" w:customStyle="1" w:styleId="IntenseQuoteChar">
-    <w:name w:val="Intense Quote Char"/>
-    <w:basedOn w:val="DefaultParagraphFont"/>
-    <w:link w:val="IntenseQuote"/>
+  <w:style w:type="character" w:customStyle="1" w:styleId="GlAlntChar">
+    <w:name w:val="Güçlü Alıntı Char"/>
+    <w:basedOn w:val="VarsaylanParagrafYazTipi"/>
+    <w:link w:val="GlAlnt"/>
     <w:uiPriority w:val="30"/>
     <w:rsid w:val="009729E7"/>
     <w:rPr>
@@ -1221,9 +2447,9 @@
       <w:color w:val="0F4761" w:themeColor="accent1" w:themeShade="BF"/>
     </w:rPr>
   </w:style>
-  <w:style w:type="character" w:styleId="IntenseReference">
+  <w:style w:type="character" w:styleId="GlBavuru">
     <w:name w:val="Intense Reference"/>
-    <w:basedOn w:val="DefaultParagraphFont"/>
+    <w:basedOn w:val="VarsaylanParagrafYazTipi"/>
     <w:uiPriority w:val="32"/>
     <w:qFormat/>
     <w:rsid w:val="009729E7"/>
@@ -1235,10 +2461,10 @@
       <w:spacing w:val="5"/>
     </w:rPr>
   </w:style>
-  <w:style w:type="paragraph" w:styleId="Header">
+  <w:style w:type="paragraph" w:styleId="stBilgi">
     <w:name w:val="header"/>
     <w:basedOn w:val="Normal"/>
-    <w:link w:val="HeaderChar"/>
+    <w:link w:val="stBilgiChar"/>
     <w:uiPriority w:val="99"/>
     <w:unhideWhenUsed/>
     <w:rsid w:val="008821CE"/>
@@ -1249,17 +2475,17 @@
       </w:tabs>
     </w:pPr>
   </w:style>
-  <w:style w:type="character" w:customStyle="1" w:styleId="HeaderChar">
-    <w:name w:val="Header Char"/>
-    <w:basedOn w:val="DefaultParagraphFont"/>
-    <w:link w:val="Header"/>
+  <w:style w:type="character" w:customStyle="1" w:styleId="stBilgiChar">
+    <w:name w:val="Üst Bilgi Char"/>
+    <w:basedOn w:val="VarsaylanParagrafYazTipi"/>
+    <w:link w:val="stBilgi"/>
     <w:uiPriority w:val="99"/>
     <w:rsid w:val="008821CE"/>
   </w:style>
-  <w:style w:type="paragraph" w:styleId="Footer">
+  <w:style w:type="paragraph" w:styleId="AltBilgi">
     <w:name w:val="footer"/>
     <w:basedOn w:val="Normal"/>
-    <w:link w:val="FooterChar"/>
+    <w:link w:val="AltBilgiChar"/>
     <w:uiPriority w:val="99"/>
     <w:unhideWhenUsed/>
     <w:rsid w:val="008821CE"/>
@@ -1270,12 +2496,42 @@
       </w:tabs>
     </w:pPr>
   </w:style>
-  <w:style w:type="character" w:customStyle="1" w:styleId="FooterChar">
-    <w:name w:val="Footer Char"/>
-    <w:basedOn w:val="DefaultParagraphFont"/>
-    <w:link w:val="Footer"/>
+  <w:style w:type="character" w:customStyle="1" w:styleId="AltBilgiChar">
+    <w:name w:val="Alt Bilgi Char"/>
+    <w:basedOn w:val="VarsaylanParagrafYazTipi"/>
+    <w:link w:val="AltBilgi"/>
     <w:uiPriority w:val="99"/>
     <w:rsid w:val="008821CE"/>
+  </w:style>
+  <w:style w:type="numbering" w:customStyle="1" w:styleId="GeerliListe1">
+    <w:name w:val="Geçerli Liste1"/>
+    <w:uiPriority w:val="99"/>
+    <w:rsid w:val="002541A3"/>
+    <w:pPr>
+      <w:numPr>
+        <w:numId w:val="5"/>
+      </w:numPr>
+    </w:pPr>
+  </w:style>
+  <w:style w:type="numbering" w:customStyle="1" w:styleId="GeerliListe2">
+    <w:name w:val="Geçerli Liste2"/>
+    <w:uiPriority w:val="99"/>
+    <w:rsid w:val="002541A3"/>
+    <w:pPr>
+      <w:numPr>
+        <w:numId w:val="7"/>
+      </w:numPr>
+    </w:pPr>
+  </w:style>
+  <w:style w:type="numbering" w:customStyle="1" w:styleId="GeerliListe3">
+    <w:name w:val="Geçerli Liste3"/>
+    <w:uiPriority w:val="99"/>
+    <w:rsid w:val="00A6477B"/>
+    <w:pPr>
+      <w:numPr>
+        <w:numId w:val="8"/>
+      </w:numPr>
+    </w:pPr>
   </w:style>
 </w:styles>
 </file>

</xml_diff>